<commit_message>
docs: actualizar nombres oficiales de los 3 integrantes en README, informe formal APF2 y guion de sustentacion
</commit_message>
<xml_diff>
--- a/docs/Guion_Grabacion_Video_PeruViajero.docx
+++ b/docs/Guion_Grabacion_Video_PeruViajero.docx
@@ -29,7 +29,11 @@
           <w:color w:val="000000"/>
           <w:sz w:val="23"/>
         </w:rPr>
-        <w:t>EVALUACIÓN: GESTIÓN DE DATOS (UNIDAD 2) | CURSO: DESARROLLO DE APLICACIONES MÓVILES (UTP) | EXPOSITOR: EDISON</w:t>
+        <w:t>EVALUACIÓN: GESTIÓN DE DATOS (UNIDAD 2) | CURSO: DESARROLLO DE APLICACIONES MÓVILES (UTP)</w:t>
+        <w:br/>
+        <w:t>INTEGRANTES: Kevin Salazar de Jesús • Edison Edgar Sivipaucar Quispe • Gerson Osmar Machuca Abanto</w:t>
+        <w:br/>
+        <w:t>EXPOSITOR: Edison Edgar Sivipaucar Quispe</w:t>
       </w:r>
     </w:p>
     <w:p>
@@ -133,7 +137,7 @@
           <w:color w:val="000000"/>
           <w:sz w:val="24"/>
         </w:rPr>
-        <w:t>Buenos días profesor Jorge Chicana y compañeros. Mi nombre es Edison y a continuación presento la sustentación técnica individual del Avance de Proyecto Final 2 para nuestra aplicación móvil PerúViajero, desarrollada para la empresa PerúViajero Tours &amp; Travel S.A.C.</w:t>
+        <w:t>Buenos días profesor Jorge Chicana y compañeros. Mi nombre es Edison Edgar Sivipaucar Quispe y, en representación de nuestro equipo conformado por Kevin Salazar de Jesús, Gerson Osmar Machuca Abanto y mi persona, presento la sustentación técnica individual del Avance de Proyecto Final 2 para nuestra aplicación móvil PerúViajero, desarrollada para la empresa PerúViajero Tours &amp; Travel S.A.C.</w:t>
         <w:br/>
         <w:br/>
         <w:t>Antes de revisar los componentes y el código, es fundamental plantear la problemática de negocio que motivó esta solución móvil. En el Perú, el sector del turismo receptivo y el transporte interprovincial adolece de un grave problema de informalidad: la venta manual de pasajes genera sobreventa, desorden en terminales y, lo más crítico, omite la validación estricta de identidad. Esto expone a las agencias a severas multas de la SUTRAN y el MTC por no registrar los 8 dígitos del DNI ni emitir el Manifiesto Oficial de Pasajeros antes del embarque.</w:t>

</xml_diff>